<commit_message>
Consolidar refinamentos da Live, referências por aula e calendário de produção do TSH
</commit_message>
<xml_diff>
--- a/70 - Produções/Cursos/Curso - Nome Provisório/10 - Raio X do Produto/Vigente/Raio-X-Fabiano Deliberalli.docx
+++ b/70 - Produções/Cursos/Curso - Nome Provisório/10 - Raio X do Produto/Vigente/Raio-X-Fabiano Deliberalli.docx
@@ -12,7 +12,7 @@
     </w:p>
     <w:p>
       <w:r>
-        <w:t>Revisão de trabalho de 30 de outubro de 2026. Preserva 9 módulos e 54 aulas. Preparada para revisão e integração ao repositório; não atesta publicação externa da oferta.</w:t>
+        <w:t>Revisão de 31 de outubro de 2026. Base conceitual de 30/10 preservada; quatro refinamentos localizados e calendário consolidado. 9 módulos, 54 aulas gravadas e 8 encontros ao vivo.</w:t>
       </w:r>
     </w:p>
     <w:p>
@@ -62,7 +62,7 @@
     </w:p>
     <w:p>
       <w:r>
-        <w:t>Encontros ao vivo: Nesta turma, a cada módulo liberado haverá um encontro online ao vivo de duas horas com Fabiano: uma hora para dúvidas e uma hora para prática orientada. A interpretação operacional adotada contempla M0 a M8: nove encontros e 18 horas ao vivo, adicionais às 54 aulas gravadas. Datas, plataforma dos encontros e política de gravação serão informadas separadamente; o acesso de um ano ao curso não implica encontros recorrentes por um ano.</w:t>
+        <w:t>Encontros ao vivo: Nesta turma, haverá oito encontros online ao vivo de duas horas com Fabiano, totalizando 16 horas: um encontro conjunto de M0 e M1 e um encontro para cada módulo de M2 a M8. Em cada encontro, a primeira hora será destinada a dúvidas e a segunda à prática orientada. Os encontros ocorrerão das 9h às 11h, horário de Brasília, conforme o calendário consolidado. São adicionais às 54 aulas gravadas. Plataforma, links e política de gravação dos encontros do curso serão informados separadamente. O acesso de um ano ao conteúdo não implica encontros recorrentes por um ano.</w:t>
       </w:r>
     </w:p>
     <w:p>
@@ -375,7 +375,7 @@
     </w:p>
     <w:p>
       <w:r>
-        <w:t>Foco: Mapear uma situação por palavras, traços, cores, imagens, gestos ou silêncio. Notar dimensões presentes e elaborar uma Tradução provisória, incluindo o que permanece desconhecido e uma participação possível.</w:t>
+        <w:t>Foco: Mapear uma situação por palavras, traços, cores, imagens, gestos ou silêncio. Notar dimensões presentes e elaborar uma Tradução provisória, incluindo o que permanece desconhecido e uma participação possível. O registro pode ajudar a descobrir um sentido ainda em elaboração; não é necessário encontrar palavras ou uma conclusão durante o exercício.</w:t>
       </w:r>
     </w:p>
     <w:p>
@@ -474,7 +474,7 @@
     </w:p>
     <w:p>
       <w:r>
-        <w:t>Foco: Construir e revisar uma Tradução provisória com diferentes mapas e linguagens. Perguntar o que percebi, associei, concluí e o que permanece desconhecido ou pode mudar minha leitura; sensibilidade inclui abertura e discernimento.</w:t>
+        <w:t>Foco: Construir e revisar uma Tradução provisória com diferentes mapas e linguagens. Perguntar o que percebi, associei, concluí e o que permanece desconhecido ou pode mudar minha leitura; sensibilidade inclui abertura e discernimento. Investigar também como uma interpretação foi construída ou recebida, o que a sustenta e o que poderia levar à sua revisão.</w:t>
       </w:r>
     </w:p>
     <w:p>
@@ -620,7 +620,7 @@
     </w:p>
     <w:p>
       <w:r>
-        <w:t>Foco: Experimentar a triangulação entre sensação percebida, contexto e nome provisório. Usar até três hipóteses de nomeação quando isso ajudar, admitindo imagem, gesto, silêncio e ainda não sei. Comparar o que cada leitura permite perceber e revisar, sem forçar uma explicação ou prometer recalibração neural.</w:t>
+        <w:t>Foco: Experimentar a triangulação entre sensação percebida, contexto e nome provisório. Usar até três hipóteses de nomeação quando isso ajudar, admitindo imagem, gesto, silêncio e ainda não sei. Comparar o que cada leitura permite perceber e revisar, sem forçar uma explicação ou prometer recalibração neural. Incluir a possibilidade de corrigir ou recusar uma formulação oferecida pelo educador, explicando o que corresponde ou não à própria experiência.</w:t>
       </w:r>
     </w:p>
     <w:p>
@@ -844,7 +844,7 @@
     </w:p>
     <w:p>
       <w:r>
-        <w:t>Foco: Comparar reencontros com temas pela espiral: condições, participação, respostas e efeitos. Incluir mudanças, impasses, menor disponibilidade e retomadas sem melhora identificável; retornar ao tema não assegura progresso.</w:t>
+        <w:t>Foco: Comparar reencontros com temas pela espiral: condições, participação, respostas e efeitos. Incluir mudanças, impasses, menor disponibilidade e retomadas sem melhora identificável; retornar ao tema não assegura progresso. Acompanhar o que foi vivido durante uma experiência, o que permaneceu depois, o sentido atribuído, sua participação na vida e as condições ainda necessárias.</w:t>
       </w:r>
     </w:p>
     <w:p>
@@ -904,7 +904,7 @@
     </w:p>
     <w:p>
       <w:r>
-        <w:t>Foco: Acolher feedbacks e pontos de vista externos divergentes sem anular suas próprias referências internas, valores e dignidade.</w:t>
+        <w:t>Foco: Acolher feedbacks e pontos de vista externos divergentes sem anular suas próprias referências internas, valores e dignidade. Escutar também sem substituir a experiência do outro pela própria interpretação, oferecendo leituras que possam ser corrigidas.</w:t>
       </w:r>
     </w:p>
     <w:p>
@@ -1294,7 +1294,7 @@
     </w:p>
     <w:p>
       <w:r>
-        <w:t>Mecanismo de Ensino: Tradução da Experiência Humana — reconhecer e diferenciar dimensões do vivido, por linguagens verbais e não verbais, colocando mapas em diálogo para ampliar possibilidades de participação e expressão situada.</w:t>
+        <w:t>Mecanismo de Ensino: Tradução da Experiência Humana — reconhecer e diferenciar dimensões do vivido, encontrar formas de expressão e elaborar sentidos ainda pouco claros, por linguagens verbais e não verbais, colocando mapas em diálogo para ampliar possibilidades de participação e expressão situada.</w:t>
       </w:r>
     </w:p>
     <w:p>
@@ -1315,6 +1315,387 @@
     <w:p>
       <w:r>
         <w:t>Forma de Comunicação Obrigatória: É proibido prometer a eliminação definitiva de padrões, o destravar instantâneo de potencial ou o equilíbrio permanente. Toda comunicação deve focar em respostas situadas, maior legibilidade da experiência, recuperação de orientação e desenvolvimento gradual de capacidades e cultivo de possibilidades ainda pouco expressas.</w:t>
+      </w:r>
+    </w:p>
+    <w:p>
+      <w:pPr>
+        <w:pStyle w:val="Heading1"/>
+      </w:pPr>
+      <w:r>
+        <w:t>Calendário da turma — 2026–2027</w:t>
+      </w:r>
+    </w:p>
+    <w:p>
+      <w:r>
+        <w:t>Masterclass: 10/11/2026, 19h–20h30, Zoom. Inscrições até 17/11/2026, 23h59. Liberação das aulas às 00h, horário de Brasília. M0 e M1 serão liberados em 17/11, inclusive para quem se inscrever antes dessa data.</w:t>
+      </w:r>
+    </w:p>
+    <w:tbl>
+      <w:tblPr>
+        <w:tblStyle w:val="LightShading-Accent1"/>
+        <w:tblW w:type="auto" w:w="0"/>
+        <w:tblLook w:firstColumn="1" w:firstRow="1" w:lastColumn="0" w:lastRow="0" w:noHBand="0" w:noVBand="1" w:val="04A0"/>
+      </w:tblPr>
+      <w:tblGrid>
+        <w:gridCol w:w="3312"/>
+        <w:gridCol w:w="3312"/>
+        <w:gridCol w:w="3312"/>
+      </w:tblGrid>
+      <w:tr>
+        <w:trPr>
+          <w:cantSplit/>
+          <w:tblHeader/>
+        </w:trPr>
+        <w:tc>
+          <w:tcPr>
+            <w:tcW w:type="dxa" w:w="3312"/>
+          </w:tcPr>
+          <w:p>
+            <w:r>
+              <w:t>Módulo</w:t>
+            </w:r>
+          </w:p>
+        </w:tc>
+        <w:tc>
+          <w:tcPr>
+            <w:tcW w:type="dxa" w:w="3312"/>
+          </w:tcPr>
+          <w:p>
+            <w:r>
+              <w:t>Liberação</w:t>
+            </w:r>
+          </w:p>
+        </w:tc>
+        <w:tc>
+          <w:tcPr>
+            <w:tcW w:type="dxa" w:w="3312"/>
+          </w:tcPr>
+          <w:p>
+            <w:r>
+              <w:t>Encontro 9h–11h</w:t>
+            </w:r>
+          </w:p>
+        </w:tc>
+      </w:tr>
+      <w:tr>
+        <w:trPr>
+          <w:cantSplit/>
+        </w:trPr>
+        <w:tc>
+          <w:tcPr>
+            <w:tcW w:type="dxa" w:w="3312"/>
+          </w:tcPr>
+          <w:p>
+            <w:r>
+              <w:t>M0</w:t>
+            </w:r>
+          </w:p>
+        </w:tc>
+        <w:tc>
+          <w:tcPr>
+            <w:tcW w:type="dxa" w:w="3312"/>
+          </w:tcPr>
+          <w:p>
+            <w:r>
+              <w:t>17/11/2026</w:t>
+            </w:r>
+          </w:p>
+        </w:tc>
+        <w:tc>
+          <w:tcPr>
+            <w:tcW w:type="dxa" w:w="3312"/>
+          </w:tcPr>
+          <w:p>
+            <w:r>
+              <w:t>28/11/2026 — conjunto M0/M1</w:t>
+            </w:r>
+          </w:p>
+        </w:tc>
+      </w:tr>
+      <w:tr>
+        <w:trPr>
+          <w:cantSplit/>
+        </w:trPr>
+        <w:tc>
+          <w:tcPr>
+            <w:tcW w:type="dxa" w:w="3312"/>
+          </w:tcPr>
+          <w:p>
+            <w:r>
+              <w:t>M1</w:t>
+            </w:r>
+          </w:p>
+        </w:tc>
+        <w:tc>
+          <w:tcPr>
+            <w:tcW w:type="dxa" w:w="3312"/>
+          </w:tcPr>
+          <w:p>
+            <w:r>
+              <w:t>17/11/2026</w:t>
+            </w:r>
+          </w:p>
+        </w:tc>
+        <w:tc>
+          <w:tcPr>
+            <w:tcW w:type="dxa" w:w="3312"/>
+          </w:tcPr>
+          <w:p>
+            <w:r>
+              <w:t>28/11/2026 — conjunto M0/M1</w:t>
+            </w:r>
+          </w:p>
+        </w:tc>
+      </w:tr>
+      <w:tr>
+        <w:trPr>
+          <w:cantSplit/>
+        </w:trPr>
+        <w:tc>
+          <w:tcPr>
+            <w:tcW w:type="dxa" w:w="3312"/>
+          </w:tcPr>
+          <w:p>
+            <w:r>
+              <w:t>M2</w:t>
+            </w:r>
+          </w:p>
+        </w:tc>
+        <w:tc>
+          <w:tcPr>
+            <w:tcW w:type="dxa" w:w="3312"/>
+          </w:tcPr>
+          <w:p>
+            <w:r>
+              <w:t>29/11/2026</w:t>
+            </w:r>
+          </w:p>
+        </w:tc>
+        <w:tc>
+          <w:tcPr>
+            <w:tcW w:type="dxa" w:w="3312"/>
+          </w:tcPr>
+          <w:p>
+            <w:r>
+              <w:t>05/12/2026</w:t>
+            </w:r>
+          </w:p>
+        </w:tc>
+      </w:tr>
+      <w:tr>
+        <w:trPr>
+          <w:cantSplit/>
+        </w:trPr>
+        <w:tc>
+          <w:tcPr>
+            <w:tcW w:type="dxa" w:w="3312"/>
+          </w:tcPr>
+          <w:p>
+            <w:r>
+              <w:t>M3</w:t>
+            </w:r>
+          </w:p>
+        </w:tc>
+        <w:tc>
+          <w:tcPr>
+            <w:tcW w:type="dxa" w:w="3312"/>
+          </w:tcPr>
+          <w:p>
+            <w:r>
+              <w:t>06/12/2026</w:t>
+            </w:r>
+          </w:p>
+        </w:tc>
+        <w:tc>
+          <w:tcPr>
+            <w:tcW w:type="dxa" w:w="3312"/>
+          </w:tcPr>
+          <w:p>
+            <w:r>
+              <w:t>12/12/2026</w:t>
+            </w:r>
+          </w:p>
+        </w:tc>
+      </w:tr>
+      <w:tr>
+        <w:trPr>
+          <w:cantSplit/>
+        </w:trPr>
+        <w:tc>
+          <w:tcPr>
+            <w:tcW w:type="dxa" w:w="3312"/>
+          </w:tcPr>
+          <w:p>
+            <w:r>
+              <w:t>M4</w:t>
+            </w:r>
+          </w:p>
+        </w:tc>
+        <w:tc>
+          <w:tcPr>
+            <w:tcW w:type="dxa" w:w="3312"/>
+          </w:tcPr>
+          <w:p>
+            <w:r>
+              <w:t>13/12/2026</w:t>
+            </w:r>
+          </w:p>
+        </w:tc>
+        <w:tc>
+          <w:tcPr>
+            <w:tcW w:type="dxa" w:w="3312"/>
+          </w:tcPr>
+          <w:p>
+            <w:r>
+              <w:t>19/12/2026</w:t>
+            </w:r>
+          </w:p>
+        </w:tc>
+      </w:tr>
+      <w:tr>
+        <w:trPr>
+          <w:cantSplit/>
+        </w:trPr>
+        <w:tc>
+          <w:tcPr>
+            <w:tcW w:type="dxa" w:w="3312"/>
+          </w:tcPr>
+          <w:p>
+            <w:r>
+              <w:t>M5</w:t>
+            </w:r>
+          </w:p>
+        </w:tc>
+        <w:tc>
+          <w:tcPr>
+            <w:tcW w:type="dxa" w:w="3312"/>
+          </w:tcPr>
+          <w:p>
+            <w:r>
+              <w:t>20/12/2026</w:t>
+            </w:r>
+          </w:p>
+        </w:tc>
+        <w:tc>
+          <w:tcPr>
+            <w:tcW w:type="dxa" w:w="3312"/>
+          </w:tcPr>
+          <w:p>
+            <w:r>
+              <w:t>09/01/2027</w:t>
+            </w:r>
+          </w:p>
+        </w:tc>
+      </w:tr>
+      <w:tr>
+        <w:trPr>
+          <w:cantSplit/>
+        </w:trPr>
+        <w:tc>
+          <w:tcPr>
+            <w:tcW w:type="dxa" w:w="3312"/>
+          </w:tcPr>
+          <w:p>
+            <w:r>
+              <w:t>M6</w:t>
+            </w:r>
+          </w:p>
+        </w:tc>
+        <w:tc>
+          <w:tcPr>
+            <w:tcW w:type="dxa" w:w="3312"/>
+          </w:tcPr>
+          <w:p>
+            <w:r>
+              <w:t>10/01/2027</w:t>
+            </w:r>
+          </w:p>
+        </w:tc>
+        <w:tc>
+          <w:tcPr>
+            <w:tcW w:type="dxa" w:w="3312"/>
+          </w:tcPr>
+          <w:p>
+            <w:r>
+              <w:t>16/01/2027</w:t>
+            </w:r>
+          </w:p>
+        </w:tc>
+      </w:tr>
+      <w:tr>
+        <w:trPr>
+          <w:cantSplit/>
+        </w:trPr>
+        <w:tc>
+          <w:tcPr>
+            <w:tcW w:type="dxa" w:w="3312"/>
+          </w:tcPr>
+          <w:p>
+            <w:r>
+              <w:t>M7</w:t>
+            </w:r>
+          </w:p>
+        </w:tc>
+        <w:tc>
+          <w:tcPr>
+            <w:tcW w:type="dxa" w:w="3312"/>
+          </w:tcPr>
+          <w:p>
+            <w:r>
+              <w:t>17/01/2027</w:t>
+            </w:r>
+          </w:p>
+        </w:tc>
+        <w:tc>
+          <w:tcPr>
+            <w:tcW w:type="dxa" w:w="3312"/>
+          </w:tcPr>
+          <w:p>
+            <w:r>
+              <w:t>23/01/2027</w:t>
+            </w:r>
+          </w:p>
+        </w:tc>
+      </w:tr>
+      <w:tr>
+        <w:trPr>
+          <w:cantSplit/>
+        </w:trPr>
+        <w:tc>
+          <w:tcPr>
+            <w:tcW w:type="dxa" w:w="3312"/>
+          </w:tcPr>
+          <w:p>
+            <w:r>
+              <w:t>M8</w:t>
+            </w:r>
+          </w:p>
+        </w:tc>
+        <w:tc>
+          <w:tcPr>
+            <w:tcW w:type="dxa" w:w="3312"/>
+          </w:tcPr>
+          <w:p>
+            <w:r>
+              <w:t>24/01/2027</w:t>
+            </w:r>
+          </w:p>
+        </w:tc>
+        <w:tc>
+          <w:tcPr>
+            <w:tcW w:type="dxa" w:w="3312"/>
+          </w:tcPr>
+          <w:p>
+            <w:r>
+              <w:t>30/01/2027</w:t>
+            </w:r>
+          </w:p>
+        </w:tc>
+      </w:tr>
+    </w:tbl>
+    <w:p>
+      <w:r>
+        <w:t>Não há encontros previstos em 26/12/2026 e 02/01/2027. M5 será liberado em 20/12 e terá encontro em 09/01. O encerramento dos encontros em 30/01/2027 não encerra o ano de acesso ao conteúdo.</w:t>
       </w:r>
     </w:p>
     <w:sectPr>

</xml_diff>

<commit_message>
Atualiza Raio X e reclassifica eixo como recurso didático
</commit_message>
<xml_diff>
--- a/70 - Produções/Cursos/Curso - Nome Provisório/10 - Raio X do Produto/Vigente/Raio-X-Fabiano Deliberalli.docx
+++ b/70 - Produções/Cursos/Curso - Nome Provisório/10 - Raio X do Produto/Vigente/Raio-X-Fabiano Deliberalli.docx
@@ -12,7 +12,7 @@
     </w:p>
     <w:p>
       <w:r>
-        <w:t>Revisão de 31 de outubro de 2026. Base conceitual de 30/10 preservada; quatro refinamentos localizados e calendário consolidado. 9 módulos, 54 aulas gravadas e 8 encontros ao vivo.</w:t>
+        <w:t>Revisão de 1º de novembro de 2026. Base conceitual de 30/10 preservada; comunicação, recursos didáticos e calendário consolidados. 9 módulos, 54 aulas em vídeo e 8 encontros ao vivo.</w:t>
       </w:r>
     </w:p>
     <w:p>
@@ -22,12 +22,30 @@
     </w:p>
     <w:p>
       <w:r>
-        <w:t>Nome do PRODUTO: Traduzindo o Ser Humano — Por que você entende seus padrões, mas continua repetindo?</w:t>
+        <w:t>Nome do PRODUTO: Traduzindo o Ser Humano.</w:t>
+      </w:r>
+    </w:p>
+    <w:p>
+      <w:pPr/>
+      <w:r>
+        <w:t>Pergunta de entrada: Por que você entende seus padrões, mas continua repetindo?</w:t>
+      </w:r>
+    </w:p>
+    <w:p>
+      <w:pPr/>
+      <w:r>
+        <w:t>Formulação de aquisição: Entender um padrão nem sempre basta para responder de outro modo.</w:t>
+      </w:r>
+    </w:p>
+    <w:p>
+      <w:pPr/>
+      <w:r>
+        <w:t>Resultado desejado: Perceber o automático mais cedo, recuperar clareza e responder com mais coerência.</w:t>
       </w:r>
     </w:p>
     <w:p>
       <w:r>
-        <w:t>Promessa: Aprenda a ampliar o acesso ao que você já compreendeu sobre si e a sustentar, nas situações reais da vida, capacidades práticas para responder com mais clareza, presença e coerência.</w:t>
+        <w:t>Promessa estratégica do percurso: Aprenda a ampliar o acesso ao que você já compreendeu sobre si e a sustentar, nas situações reais da vida, capacidades práticas para responder com mais clareza, presença e coerência.</w:t>
       </w:r>
     </w:p>
     <w:p>
@@ -62,7 +80,7 @@
     </w:p>
     <w:p>
       <w:r>
-        <w:t>Encontros ao vivo: Nesta turma, haverá oito encontros online ao vivo de duas horas com Fabiano, totalizando 16 horas: um encontro conjunto de M0 e M1 e um encontro para cada módulo de M2 a M8. Em cada encontro, a primeira hora será destinada a dúvidas e a segunda à prática orientada. Os encontros ocorrerão das 9h às 11h, horário de Brasília, conforme o calendário consolidado. São adicionais às 54 aulas gravadas. Plataforma, links e política de gravação dos encontros do curso serão informados separadamente. O acesso de um ano ao conteúdo não implica encontros recorrentes por um ano.</w:t>
+        <w:t>Encontros ao vivo: Nesta turma, haverá oito encontros online ao vivo de duas horas com Fabiano, totalizando 16 horas: um encontro conjunto de M0 e M1 e um encontro para cada módulo de M2 a M8. Em cada encontro, a primeira hora será destinada a dúvidas e a segunda à prática orientada. Os encontros ocorrerão das 9h às 11h, horário de Brasília, conforme o calendário consolidado. São adicionais às 54 aulas em vídeo. Os encontros serão realizados pelo Zoom, com link disponibilizado no grupo de WhatsApp da turma. Quem não participar ao vivo poderá assistir posteriormente à gravação na Hotmart, na área correspondente às aulas on-line. O prazo de publicação não foi definido. O acesso de um ano ao conteúdo não implica encontros recorrentes por um ano.</w:t>
       </w:r>
     </w:p>
     <w:p>
@@ -128,7 +146,7 @@
     </w:p>
     <w:p>
       <w:r>
-        <w:t>Perceber quando está se afastando de seu eixo — Reconhecer precocemente mudanças corporais, emocionais e relacionais que indicam perda de presença e rigidez.</w:t>
+        <w:t>Perceber mais cedo quando entrou no automático — Reconhecer mudanças corporais, emocionais e relacionais antes que uma resposta conhecida assuma toda a situação.</w:t>
       </w:r>
     </w:p>
     <w:p>
@@ -263,7 +281,7 @@
     </w:p>
     <w:p>
       <w:r>
-        <w:t>Foco: Apresentar o funcionamento do curso e a perspectiva multidimensional, espiritual e transpessoal de Fabiano. Explicar a articulação entre aulas gravadas, encontros online ao vivo e experiências cotidianas, acolhendo diferentes linguagens e modos de participação.</w:t>
+        <w:t>Foco: Apresentar o funcionamento do curso e a perspectiva multidimensional, espiritual e transpessoal de Fabiano. Explicar a articulação entre aulas em vídeo, encontros online ao vivo e experiências cotidianas, acolhendo diferentes linguagens e modos de participação.</w:t>
       </w:r>
     </w:p>
     <w:p>
@@ -388,7 +406,7 @@
     </w:p>
     <w:p>
       <w:r>
-        <w:t>Foco: Observar estado, movimento, referência e participação pelo pêndulo; distinguir intensidade da experiência e restrição das respostas. Introduzir a espiral como reencontro com temas ao longo do tempo, incluindo impasses. EIXO orienta a participação sem exigir imobilidade.</w:t>
+        <w:t>Foco: Observar estado, movimento, referência e participação pelo pêndulo; distinguir intensidade da experiência e restrição das respostas. Introduzir a espiral como reencontro com temas ao longo do tempo, incluindo impasses. Usar a imagem do eixo, quando útil, para investigar referência, deslocamento e retorno, sem transformá-la em estrutura central do curso.</w:t>
       </w:r>
     </w:p>
     <w:p>
@@ -680,7 +698,7 @@
     </w:p>
     <w:p>
       <w:r>
-        <w:t>Foco: Coordenação interna: aprender a escutar impulsos de autopreservação (medo, vergonha, raiva, etc) sem deixar que eles assumam as decisões de forma automática.</w:t>
+        <w:t>Foco: Reconhecer necessidades, impulsos, medos, valores e perspectivas que aparecem ao mesmo tempo, sem permitir que uma delas determine automaticamente a resposta.</w:t>
       </w:r>
     </w:p>
     <w:p>
@@ -701,12 +719,12 @@
         <w:pStyle w:val="Heading2"/>
       </w:pPr>
       <w:r>
-        <w:t>Aula 3 — Os Três Eus e a função EIXO</w:t>
+        <w:t>Aula 3 — Os Três Eus como mapa de coordenação</w:t>
       </w:r>
     </w:p>
     <w:p>
       <w:r>
-        <w:t>Foco: Apresentar os Três Eus como mapa autoral de funções: sustentação e sensibilidade, mediação reflexiva e orientação por sentido. Diferenciar Eu Superior, Self, Essência e referência profunda desde a introdução. EIXO participa da coordenação e não equivale a nenhum desses termos ou a uma estrutura cerebral.</w:t>
+        <w:t>Foco: Apresentar os Três Eus como mapa autoral de funções: sustentação e sensibilidade, mediação reflexiva e orientação por sentido. Diferenciar Eu Superior, Self, Essência e referência profunda desde a introdução. Os três Eus podem ser coordenados sem corresponder a estruturas cerebrais ou a entidades fixas.</w:t>
       </w:r>
     </w:p>
     <w:p>
@@ -792,7 +810,7 @@
     </w:p>
     <w:p>
       <w:r>
-        <w:t>Foco: Polaridades e neutralidade. Compreender a integração interna como um processo ecológico que respeita a diversidade de necessidades íntimas, sem forçar um estado de harmonia artificial.</w:t>
+        <w:t>Foco: Compreender integração como relação entre diferenças corporais, emocionais, mentais, relacionais, energéticas e espirituais, sem homogeneizá-las nem forçar harmonia.</w:t>
       </w:r>
     </w:p>
     <w:p>
@@ -805,7 +823,7 @@
     </w:p>
     <w:p>
       <w:r>
-        <w:t>Foco: Desenvolver uma visão unificada que diferencie corpo, mente e espírito sem cindir o indivíduo em gavetas isoladas.</w:t>
+        <w:t>Foco: Diferenciar corpo, emoções, pensamentos, relações, energia e espiritualidade, reconhecendo suas conexões sem tratá-los como equivalentes ou compartimentos isolados.</w:t>
       </w:r>
     </w:p>
     <w:p>
@@ -839,7 +857,7 @@
         <w:pStyle w:val="Heading2"/>
       </w:pPr>
       <w:r>
-        <w:t>Aula 5 — Tradução e EIXO em espiral</w:t>
+        <w:t>Aula 5 — Tradução e retorno em espiral</w:t>
       </w:r>
     </w:p>
     <w:p>
@@ -891,7 +909,7 @@
     </w:p>
     <w:p>
       <w:r>
-        <w:t>Foco: Comunicar o próprio desconforto sem transformar a expressão íntima em julgamento ou ataque defensivo ao parceiro.</w:t>
+        <w:t>Foco: Comunicar percepções, necessidades e impactos sem converter a própria experiência em julgamento ou acusação, em diferentes tipos de relação.</w:t>
       </w:r>
     </w:p>
     <w:p>
@@ -1052,20 +1070,32 @@
     </w:p>
     <w:p>
       <w:r>
-        <w:t>Bônus 1. Mapas Visuais do Percurso — Imagens para investigar dimensões, desenvolvimento, campo, sustentação, movimento, reencontros e possibilidades de expressão. Árvore, pêndulo, espiral, circulação e árvore em relação com o Cosmos são apresentados conforme sua função pedagógica.</w:t>
+        <w:t>Não há bônus artificiais. Os materiais abaixo integram a formação.</w:t>
       </w:r>
     </w:p>
     <w:p>
       <w:r>
-        <w:t>Bônus 2. Fichas de Exercícios Práticos — Registros breves, verbais e não verbais, escolhidos conforme a aula. Incluem percebido, associado, concluído e desconhecido; condições de participação, efeitos, apoios e transferência à vida. Não é necessário preencher todos os campos em toda prática.</w:t>
+        <w:t>Mapas Visuais do Percurso — Imagens para investigar dimensões, desenvolvimento, campo, sustentação, movimento, reencontros e possibilidades de expressão. Árvore, pêndulo, espiral, escada, artesão, espelho, eixo, circulação e árvore em relação com o Cosmos são usados conforme a função de cada aula.</w:t>
       </w:r>
     </w:p>
     <w:p>
       <w:r>
-        <w:t>Bônus 3. Guia de Palavras e Conceitos (formato E-book) — Guia de funções, fontes e usos de termos psicológicos, científicos, tradicionais e espirituais, com exemplos e distinções. Amplia o vocabulário sem exigir nomeação e sem substituir a experiência por categorias.</w:t>
+        <w:t>Fichas de Exercícios Práticos — Registros breves, verbais e não verbais, escolhidos conforme a aula. Incluem percebido, associado, concluído e desconhecido; condições de participação, efeitos, apoios e transferência à vida. Não é necessário preencher todos os campos em toda prática.</w:t>
       </w:r>
     </w:p>
     <w:p>
+      <w:r>
+        <w:t>Resumos de Integração — Sínteses para retomar as distinções principais e relacioná-las ao percurso, sem substituir a experiência ou exigir memorização.</w:t>
+      </w:r>
+    </w:p>
+    <w:p>
+      <w:pPr/>
+      <w:r>
+        <w:t>Guia de Palavras e Conceitos — Guia de funções, fontes e usos de termos psicológicos, científicos, tradicionais e espirituais, com exemplos e distinções. Amplia o vocabulário sem exigir nomeação e sem substituir a experiência por categorias.</w:t>
+      </w:r>
+    </w:p>
+    <w:p>
+      <w:pPr/>
       <w:r>
         <w:t>Recurso Complementar. Comunidade de Continuidade — Possibilidade de troca, cultivo, dúvidas e integração. Sua pertinência depende das condições do grupo e de cada participante; não constitui requisito de autonomia nem garantia de sustentação suficiente para todos. Duração, moderação e regras de funcionamento precisam ser explicitadas na oferta.</w:t>
       </w:r>
@@ -1080,22 +1110,22 @@
     </w:p>
     <w:p>
       <w:r>
-        <w:t>A fragmentação central: Sentir um "abismo" entre aquilo que a pessoa já compreendeu racionalmente na terapia, em cursos ou em livros, aquilo que sente fisicamente e o que de fato consegue responder na vida prática.</w:t>
+        <w:t>Entender um padrão e, ainda assim, reagir do mesmo modo quando uma situação mobiliza a pessoa.</w:t>
       </w:r>
     </w:p>
     <w:p>
       <w:r>
-        <w:t>Acumular uma quantidade imensa de conhecimento psicológico e espiritual, mas perceber que ele "desaparece" e perde o acesso quando é criticado ou mobilizado em uma discussão real.</w:t>
+        <w:t>Ter conhecimento psicológico ou espiritual, mas encontrá-lo pouco acessível diante de crítica, conflito ou vulnerabilidade.</w:t>
       </w:r>
     </w:p>
     <w:p>
       <w:r>
-        <w:t>Vivenciar dores físicas e emocionais profundas (como taquicardia, aperto e estresse genérico), mas ainda não encontrar formas de reconhecer e comunicar o que está acontecendo, sentindo-se desorganizado ou exagerado.</w:t>
+        <w:t>Perceber sinais corporais e emocionais intensos, mas ter dificuldade para reconhecer e comunicar o que está acontecendo.</w:t>
       </w:r>
     </w:p>
     <w:p>
       <w:r>
-        <w:t>Confundir o fato que ocorreu, a reação biológica que surgiu no corpo, a emoção gerada, o pensamento reativo e as projeções mentais criadas a partir do passado.</w:t>
+        <w:t>Misturar o que aconteceu, o que foi sentido, o que foi lembrado e as interpretações produzidas naquele momento.</w:t>
       </w:r>
     </w:p>
     <w:p>
@@ -1191,27 +1221,27 @@
     </w:p>
     <w:p>
       <w:r>
-        <w:t>Problema central — A fragmentação sistêmica entre o que o indivíduo sabe, o que sente no corpo e o que efetivamente consegue sustentar na experiência real sob ativação.</w:t>
+        <w:t>Problema central — A pessoa entende seus padrões, mas, quando algo a mobiliza, perde acesso ao que sabe e reage do mesmo modo.</w:t>
       </w:r>
     </w:p>
     <w:p>
       <w:r>
-        <w:t>Experiência sem tradução legível: A tendência crônica de misturar fato, ativação corporal, sentimento, pensamento e as interpretações criadas no piloto automático.</w:t>
+        <w:t>Experiência pouco diferenciada: Misturar o que aconteceu, sinais do corpo, sentimentos, pensamentos, memórias e interpretações.</w:t>
       </w:r>
     </w:p>
     <w:p>
       <w:r>
-        <w:t>Identificação tardia do automatismo: Perceber que foi sequestrado por um padrão reativo apenas depois que a relação ou a situação prática já foi prejudicada.</w:t>
+        <w:t>Identificação tardia do automatismo: Reconhecer a repetição apenas depois que a resposta já produziu efeitos.</w:t>
       </w:r>
     </w:p>
     <w:p>
       <w:r>
-        <w:t>Excesso de conhecimento desconectado: O acúmulo de mapas científicos, terapêuticos e espirituais sem uma arquitetura central que permita correlacioná-los de forma coerente e prática.</w:t>
+        <w:t>Excesso de conhecimento desconectado: Acumular mapas científicos, terapêuticos e espirituais sem uma forma prática de relacioná-los à própria experiência.</w:t>
       </w:r>
     </w:p>
     <w:p>
       <w:r>
-        <w:t>Inacessibilidade das capacidades no cotidiano: O desaparecimento do repertório de autoconhecimento justamente nos instantes em que o estresse, a provocação ou a vulnerabilidade exigem uma resposta situada.</w:t>
+        <w:t>Pouco acesso às capacidades no cotidiano: Ter dificuldade para usar o que já compreendeu quando estresse, conflito ou vulnerabilidade exigem uma resposta.</w:t>
       </w:r>
     </w:p>
     <w:p>
@@ -1269,12 +1299,12 @@
     </w:p>
     <w:p>
       <w:r>
-        <w:t>Antecedente de consolidação: 23 de agosto de 2026; Word confirmado em 24 de outubro. Revisão de trabalho solicitada em 30 de outubro de 2026.</w:t>
+        <w:t>Antecedente de consolidação: 23 de agosto de 2026; Word confirmado em 24 de outubro. Revisão de trabalho solicitada em 30 de outubro e consolidada em 1º de novembro de 2026.</w:t>
       </w:r>
     </w:p>
     <w:p>
       <w:r>
-        <w:t>Arquitetura pública e de entrega: 9 módulos e 54 aulas curtas e progressivas.</w:t>
+        <w:t>Arquitetura pública e de entrega: 9 módulos e 54 aulas em vídeo, curtas e progressivas.</w:t>
       </w:r>
     </w:p>
     <w:p>
@@ -1285,6 +1315,18 @@
     <w:p>
       <w:r>
         <w:t>Headline de Entrada: Por que você entende seus padrões, mas continua repetindo?</w:t>
+      </w:r>
+    </w:p>
+    <w:p>
+      <w:pPr/>
+      <w:r>
+        <w:t>Formulação de aquisição: Entender um padrão nem sempre basta para responder de outro modo.</w:t>
+      </w:r>
+    </w:p>
+    <w:p>
+      <w:pPr/>
+      <w:r>
+        <w:t>Resultado desejado: Perceber o automático mais cedo, recuperar clareza e responder com mais coerência.</w:t>
       </w:r>
     </w:p>
     <w:p>
@@ -1299,11 +1341,6 @@
     </w:p>
     <w:p>
       <w:r>
-        <w:t>Função Pedagógica EIXO: É um mapa interno de retorno, diferenciação e orientação prática. Não deve ser anunciado como um método comercial apartado ou marca paralela de mercado.</w:t>
-      </w:r>
-    </w:p>
-    <w:p>
-      <w:r>
         <w:t>Definição de Presença que Sustenta: Presença suficiente para continuar em contato com o que acontece, diferenciar o que está misturado e recuperar orientação antes que o impulso decida tudo sozinho. Não representa tranquilidade permanente ou imunidade a ativações fisiológicas.</w:t>
       </w:r>
     </w:p>
@@ -1314,7 +1351,7 @@
     </w:p>
     <w:p>
       <w:r>
-        <w:t>Forma de Comunicação Obrigatória: É proibido prometer a eliminação definitiva de padrões, o destravar instantâneo de potencial ou o equilíbrio permanente. Toda comunicação deve focar em respostas situadas, maior legibilidade da experiência, recuperação de orientação e desenvolvimento gradual de capacidades e cultivo de possibilidades ainda pouco expressas.</w:t>
+        <w:t>Limites éticos e comunicacionais: Não prometer eliminação definitiva de padrões, desbloqueio instantâneo de potencial ou equilíbrio permanente. A comunicação deve tratar de respostas situadas, maior legibilidade da experiência, recuperação de orientação e desenvolvimento gradual de capacidades e possibilidades ainda pouco expressas.</w:t>
       </w:r>
     </w:p>
     <w:p>
@@ -1322,7 +1359,7 @@
         <w:pStyle w:val="Heading1"/>
       </w:pPr>
       <w:r>
-        <w:t>Calendário da turma — 2026–2027</w:t>
+        <w:t>Calendário consolidado — 2026–2027</w:t>
       </w:r>
     </w:p>
     <w:p>

</xml_diff>